<commit_message>
fix(p9): mask self-citations in MIR manuscript for double-blind review
- In-text 'Do/Đỗ & Phan, 2025' → '(Authors, 2025)'; reference entry and the
  identifying IntechOpen DOI removed (Details omitted for double-blind review).
- Retains the prior-work non-overlap disclosure in third person; the cover
  letter keeps real names + DOI (editor-only, unblinded).
- Regenerated manuscript docx and refreshed bundle.

Co-Authored-By: Claude Opus 4.8 (1M context) <noreply@anthropic.com>
Claude-Session: https://claude.ai/code/session_01Xumaoraa2DLWLXsgJJ62oq
</commit_message>
<xml_diff>
--- a/dist/BO_NOP_HOAN_CHINH_2026-06/1_papers/P9_MIR/01_manuscript_blinded.docx
+++ b/dist/BO_NOP_HOAN_CHINH_2026-06/1_papers/P9_MIR/01_manuscript_blinded.docx
@@ -140,7 +140,7 @@
         <w:pStyle w:val="FirstParagraph"/>
       </w:pPr>
       <w:r>
-        <w:t xml:space="preserve">This study examines whether the inverted-U relationship between export intensity and firm productivity among Indian private firms is structurally durable across the 2014 to 2025 institutional and digital transformation decade (demonetisation, GST, IBC, UPI saturation, PLI, Atmanirbhar Bharat), and whether technological and digital capabilities moderate the threshold. Three World Bank Enterprise Survey waves for India (2014 PICS3, 2022 BEE, 2025 BREADY; analytic N = 28,717) are estimated by OLS with HC1 robust standard errors, quadratic FSTS terms, and capability interactions; Lind–Mehlum U-tests verify the inverted-U per wave and Paternoster z-tests evaluate 2014-versus-2025 coefficient equality, with the April 2016 UPI rollout providing a quasi-experiment for digital saturation. The inverted-U structurally collapses: the turning point migrates from FSTS = 61.8 per cent (2014) to 40.7 per cent (2022), and by 2025 the curvature term is insignificant (β₂ = −0.16, p = 0.42) and the relationship is monotonically negative. Paternoster z-tests reject coefficient equality for the linear (z = −7.94) and quadratic (z = +4.17) terms (both p &lt; 0.0001), and the UPI Tier-2 e-payment interaction is negative (FSTS × DAI_epay = −4.02, p = 0.004). The study provides the first firm-level evidence that extreme institutional transformation can dissolve, rather than relocate, the inverted-U threshold, identifying a previously untested scope condition for the Lu and Beamish (2004) claim: the threshold is conditional on institutional stability. The authors’ earlier work (Do and Phan, 2025) is acknowledged as prior author work.</w:t>
+        <w:t xml:space="preserve">This study examines whether the inverted-U relationship between export intensity and firm productivity among Indian private firms is structurally durable across the 2014 to 2025 institutional and digital transformation decade (demonetisation, GST, IBC, UPI saturation, PLI, Atmanirbhar Bharat), and whether technological and digital capabilities moderate the threshold. Three World Bank Enterprise Survey waves for India (2014 PICS3, 2022 BEE, 2025 BREADY; analytic N = 28,717) are estimated by OLS with HC1 robust standard errors, quadratic FSTS terms, and capability interactions; Lind–Mehlum U-tests verify the inverted-U per wave and Paternoster z-tests evaluate 2014-versus-2025 coefficient equality, with the April 2016 UPI rollout providing a quasi-experiment for digital saturation. The inverted-U structurally collapses: the turning point migrates from FSTS = 61.8 per cent (2014) to 40.7 per cent (2022), and by 2025 the curvature term is insignificant (β₂ = −0.16, p = 0.42) and the relationship is monotonically negative. Paternoster z-tests reject coefficient equality for the linear (z = −7.94) and quadratic (z = +4.17) terms (both p &lt; 0.0001), and the UPI Tier-2 e-payment interaction is negative (FSTS × DAI_epay = −4.02, p = 0.004). The study provides the first firm-level evidence that extreme institutional transformation can dissolve, rather than relocate, the inverted-U threshold, identifying a previously untested scope condition for the Lu and Beamish (2004) claim: the threshold is conditional on institutional stability. The authors’ earlier work (Authors, 2025) is acknowledged as prior author work.</w:t>
       </w:r>
     </w:p>
     <w:p>
@@ -277,7 +277,7 @@
         </w:numPr>
       </w:pPr>
       <w:r>
-        <w:t xml:space="preserve">Complements but does not duplicate prior author work on TMT moderation in Indian firms (Do &amp; Phan, 2025, IntechOpen).</w:t>
+        <w:t xml:space="preserve">Complements but does not duplicate prior author work on TMT moderation in Indian firms (Authors, 2025).</w:t>
       </w:r>
     </w:p>
     <w:p>
@@ -334,7 +334,7 @@
         <w:pStyle w:val="BodyText"/>
       </w:pPr>
       <w:r>
-        <w:t xml:space="preserve">This study extends but does not duplicate the authors’ earlier work on Indian firms. Do and Phan (2025) examined a matched sub-sample of 380 firms across two waves. That study used a linear specification of degree of internationalisation, the Uppsala (Johanson and Vahlne, 1977) and Upper Echelons (Hambrick and Mason, 1984) frameworks, feasible generalised least squares estimation, and top-management-team moderation as the central research question. The present study uses a different theoretical lens (the institutions-based view), a different specification (quadratic inverted-U with Lind–Mehlum testing), a different sample (the full WBES across three waves), a different method (ordinary least squares with heteroscedasticity-robust and state-clustered standard errors), and a different research question (threshold dynamics under institutional shift). The two studies are complementary rather than overlapping. The prior work characterises managerial mechanisms operating within the firm. The present work characterises institutional mechanisms operating on the firm.</w:t>
+        <w:t xml:space="preserve">This study extends but does not duplicate the authors’ earlier work on Indian firms. Authors (2025) examined a matched sub-sample of 380 firms across two waves. That study used a linear specification of degree of internationalisation, the Uppsala (Johanson and Vahlne, 1977) and Upper Echelons (Hambrick and Mason, 1984) frameworks, feasible generalised least squares estimation, and top-management-team moderation as the central research question. The present study uses a different theoretical lens (the institutions-based view), a different specification (quadratic inverted-U with Lind–Mehlum testing), a different sample (the full WBES across three waves), a different method (ordinary least squares with heteroscedasticity-robust and state-clustered standard errors), and a different research question (threshold dynamics under institutional shift). The two studies are complementary rather than overlapping. The prior work characterises managerial mechanisms operating within the firm. The present work characterises institutional mechanisms operating on the firm.</w:t>
       </w:r>
     </w:p>
     <w:p>
@@ -6976,7 +6976,7 @@
         <w:pStyle w:val="BodyText"/>
       </w:pPr>
       <w:r>
-        <w:t xml:space="preserve">The five robustness specifications reported in §4.6 reinforce the structural interpretation. The manufacturing-only sub-sample confirms the cross-wave shift with Paternoster z-tests within 12 per cent of full-sample magnitudes. This rules out service-firm composition as a driver. The trimmed-FSTS specification rules out extreme exporter influence. The size sub-sample analysis reveals a finer nuance. The 2014 inverted-U was concentrated in larger firms (employees ≥ 100). The pattern extended to smaller firms only by 2022 before collapsing for both segments in 2025. This pattern is consistent with the documented broadening of SME exporter participation under the 2014 to 2020 export-promotion policy expansion, followed by its post-2020 reversal under Atmanirbhar Bharat. The pattern is not consistent with a measurement-induced collapse.</w:t>
+        <w:t xml:space="preserve">The five robustness specifications reported in Section 4.6 reinforce the structural interpretation. The manufacturing-only sub-sample confirms the cross-wave shift with Paternoster z-tests within 12 per cent of full-sample magnitudes. This rules out service-firm composition as a driver. The trimmed-FSTS specification rules out extreme exporter influence. The size sub-sample analysis reveals a finer nuance. The 2014 inverted-U was concentrated in larger firms (employees ≥ 100). The pattern extended to smaller firms only by 2022 before collapsing for both segments in 2025. This pattern is consistent with the documented broadening of SME exporter participation under the 2014 to 2020 export-promotion policy expansion, followed by its post-2020 reversal under Atmanirbhar Bharat. The pattern is not consistent with a measurement-induced collapse.</w:t>
       </w:r>
     </w:p>
     <w:bookmarkEnd w:id="53"/>
@@ -7158,7 +7158,7 @@
         <w:pStyle w:val="FirstParagraph"/>
       </w:pPr>
       <w:r>
-        <w:t xml:space="preserve">The findings are bounded in five ways. Firstly, the three waves are independent cross-sections rather than within-firm panels. Within-firm causal claims are not supported. Secondly, the 2014, 2022, and 2025 instruments are not identical. However, the monotone trajectory across the 2022 bridge supports a structural rather than artifactual interpretation. Thirdly, DAI Tier-2 is measured only in 2025, restricting Tier-1-versus-Tier-2 comparisons to the post-UPI wave. Fourthly, standard errors are heteroscedasticity-robust (HC1) in the primary specification and state-clustered (approximately 24 clusters) in the robustness specification. With this cluster count, the asymptotic justification for cluster-robust inference is borderline. Wild cluster bootstrap (Cameron et al., 2008; MacKinnon and Webb, 2017) would tighten inference in revision. Fifthly, the DAI_epay endogeneity concern noted in §5.2 remains unresolved and qualifies the H4b reinterpretation.</w:t>
+        <w:t xml:space="preserve">The findings are bounded in five ways. Firstly, the three waves are independent cross-sections rather than within-firm panels. Within-firm causal claims are not supported. Secondly, the 2014, 2022, and 2025 instruments are not identical. However, the monotone trajectory across the 2022 bridge supports a structural rather than artifactual interpretation. Thirdly, DAI Tier-2 is measured only in 2025, restricting Tier-1-versus-Tier-2 comparisons to the post-UPI wave. Fourthly, standard errors are heteroscedasticity-robust (HC1) in the primary specification and state-clustered (approximately 24 clusters) in the robustness specification. With this cluster count, the asymptotic justification for cluster-robust inference is borderline. Wild cluster bootstrap (Cameron et al., 2008; MacKinnon and Webb, 2017) would tighten inference in revision. Fifthly, the DAI_epay endogeneity concern noted in Section 5.2 remains unresolved and qualifies the H4b reinterpretation.</w:t>
       </w:r>
     </w:p>
     <w:bookmarkEnd w:id="58"/>
@@ -7177,7 +7177,7 @@
         <w:pStyle w:val="FirstParagraph"/>
       </w:pPr>
       <w:r>
-        <w:t xml:space="preserve">The substantive limitations are detailed in §5.6. One further measurement caveat warrants emphasis: the 2025 wave coincides with a sharp contraction in export engagement (mean FSTS falls from 7.2 per cent in 2014 to 2.7 per cent in 2025, and the number of firms above 50 per cent FSTS falls from 536 to 141), so the loss of significant quadratic curvature in 2025 partly reflects reduced identifying variation in the high-export tail. The threshold-dissolution finding should therefore be read as conditional on the post-Atmanirbhar export contraction. Importantly, however, the sign of the low-export slope itself reverses, from a positive ascending limb in 2014 to a monotone negative relationship in 2025, a qualitative change that thinner tail support alone does not generate. Three additional directions for future research follow from them.</w:t>
+        <w:t xml:space="preserve">The substantive limitations are detailed in Section 5.6. One further measurement caveat warrants emphasis: the 2025 wave coincides with a sharp contraction in export engagement (mean FSTS falls from 7.2 per cent in 2014 to 2.7 per cent in 2025, and the number of firms above 50 per cent FSTS falls from 536 to 141), so the loss of significant quadratic curvature in 2025 partly reflects reduced identifying variation in the high-export tail. The threshold-dissolution finding should therefore be read as conditional on the post-Atmanirbhar export contraction. Importantly, however, the sign of the low-export slope itself reverses, from a positive ascending limb in 2014 to a monotone negative relationship in 2025, a qualitative change that thinner tail support alone does not generate. Three additional directions for future research follow from them.</w:t>
       </w:r>
     </w:p>
     <w:p>
@@ -7201,7 +7201,7 @@
         <w:pStyle w:val="BodyText"/>
       </w:pPr>
       <w:r>
-        <w:t xml:space="preserve">Thirdly, the authors’ prior work (Do and Phan, 2025) examined top-management-team moderators of a linear DOI-performance relationship in a matched sub-sample of 380 Indian firms. The two studies are complementary. The prior work characterises managerial mechanisms operating within the firm. The present study characterises institutional mechanisms operating on the firm. A unified treatment of TMT moderation and institutional scope conditions, feasible if the matched panel can be expanded, would address both the within-firm and the between-environment determinants of the I-P relationship.</w:t>
+        <w:t xml:space="preserve">Thirdly, the authors’ prior work (Authors, 2025) examined top-management-team moderators of a linear DOI-performance relationship in a matched sub-sample of 380 Indian firms. The two studies are complementary. The prior work characterises managerial mechanisms operating within the firm. The present study characterises institutional mechanisms operating on the firm. A unified treatment of TMT moderation and institutional scope conditions, feasible if the matched panel can be expanded, would address both the within-firm and the between-environment determinants of the I-P relationship.</w:t>
       </w:r>
     </w:p>
     <w:p>
@@ -7234,7 +7234,7 @@
         <w:pStyle w:val="BodyText"/>
       </w:pPr>
       <w:r>
-        <w:t xml:space="preserve">The authors also acknowledge an earlier related work (Do and Phan, 2025, IntechOpen, DOI 10.5772/intechopen.1011012) which examined top-management-team moderators on the linear internationalisation–performance relationship in a matched sub-sample of 380 Indian firms. The present manuscript adopts a different theoretical lens (the institutions-based view), empirical specification (quadratic inverted-U), and research question (threshold durability) using the full WBES samples. The two studies are intended to be complementary rather than overlapping.</w:t>
+        <w:t xml:space="preserve">The authors also acknowledge an earlier related work (Authors, 2025) which examined top-management-team moderators on the linear internationalisation–performance relationship in a matched sub-sample of 380 Indian firms. The present manuscript adopts a different theoretical lens (the institutions-based view), empirical specification (quadratic inverted-U), and research question (threshold durability) using the full WBES samples. The two studies are intended to be complementary rather than overlapping.</w:t>
       </w:r>
     </w:p>
     <w:bookmarkEnd w:id="61"/>
@@ -7691,35 +7691,7 @@
         <w:pStyle w:val="BodyText"/>
       </w:pPr>
       <w:r>
-        <w:t xml:space="preserve">Do, T.H. and Phan, A.T. (2025),</w:t>
-      </w:r>
-      <w:r>
-        <w:t xml:space="preserve"> </w:t>
-      </w:r>
-      <w:r>
-        <w:t xml:space="preserve">“</w:t>
-      </w:r>
-      <w:r>
-        <w:t xml:space="preserve">Internationalization and firm performance of firms in India: the role of top management</w:t>
-      </w:r>
-      <w:r>
-        <w:t xml:space="preserve">”</w:t>
-      </w:r>
-      <w:r>
-        <w:t xml:space="preserve">, in</w:t>
-      </w:r>
-      <w:r>
-        <w:t xml:space="preserve"> </w:t>
-      </w:r>
-      <w:r>
-        <w:rPr>
-          <w:iCs/>
-          <w:i/>
-        </w:rPr>
-        <w:t xml:space="preserve">International Business Research, Traditional and Creative Approaches</w:t>
-      </w:r>
-      <w:r>
-        <w:t xml:space="preserve">, IntechOpen, London, available at: https://doi.org/10.5772/intechopen.1011012</w:t>
+        <w:t xml:space="preserve">Authors (2025). Details omitted for double-blind review.</w:t>
       </w:r>
     </w:p>
     <w:p>

</xml_diff>